<commit_message>
Phase 1 complete: content, monetization, audit logging, search fixes
- Add VNPay payment gateway integration
- Add chapter audit logging (CREATE/UPDATE/DELETE_CHAPTER, UNLOCK_CHAPTER)
- Export writeAuditLog; wire CREATE/UPDATE/DELETE_NOVEL audit entries
- Fix coverImageUrl Zod validation (empty string → undefined)
- Fix NovelSearchDoc missing avgRating field (build error)
- Add rankings page with trending/rating/chapters sort tabs
- Add active nav state highlighting (NavLinks client component)
- Add sign-out button on settings page
- Add LockOpen icon for unlocked VIP chapters
- Add VNPay sandbox API routes and test endpoint

Co-Authored-By: Claude Sonnet 4.6 <noreply@anthropic.com>
</commit_message>
<xml_diff>
--- a/docs/ADD.docx
+++ b/docs/ADD.docx
@@ -34,32 +34,6 @@
         <w:t xml:space="preserve">17/05/2026</w:t>
       </w:r>
     </w:p>
-    <w:sdt>
-      <w:sdtPr>
-        <w:docPartObj>
-          <w:docPartGallery w:val="Table of Contents"/>
-          <w:docPartUnique/>
-        </w:docPartObj>
-      </w:sdtPr>
-      <w:sdtContent>
-        <w:p>
-          <w:pPr>
-            <w:pStyle w:val="TOCHeading"/>
-          </w:pPr>
-          <w:r>
-            <w:t xml:space="preserve">Table of Contents</w:t>
-          </w:r>
-        </w:p>
-        <w:p>
-          <w:r>
-            <w:fldChar w:fldCharType="begin" w:dirty="true"/>
-            <w:instrText xml:space="preserve">TOC \o "1-4" \h \z \u</w:instrText>
-            <w:fldChar w:fldCharType="separate"/>
-            <w:fldChar w:fldCharType="end"/>
-          </w:r>
-        </w:p>
-      </w:sdtContent>
-    </w:sdt>
     <w:bookmarkStart w:id="9" w:name="revision-history"/>
     <w:p>
       <w:pPr>
@@ -350,7 +324,7 @@
       </w:r>
     </w:p>
     <w:bookmarkEnd w:id="10"/>
-    <w:bookmarkStart w:id="38" w:name="quality-attribute-requirements"/>
+    <w:bookmarkStart w:id="39" w:name="quality-attribute-requirements"/>
     <w:p>
       <w:pPr>
         <w:pStyle w:val="Heading1"/>
@@ -380,16 +354,250 @@
         <w:t xml:space="preserve">.</w:t>
       </w:r>
     </w:p>
-    <w:bookmarkStart w:id="16" w:name="security"/>
+    <w:bookmarkStart w:id="11" w:name="X2a70b9d2359554b1e284a9915d7c5d3a6f7de77"/>
     <w:p>
       <w:pPr>
         <w:pStyle w:val="Heading2"/>
       </w:pPr>
       <w:r>
+        <w:t xml:space="preserve">2.0 Quality Attribute Implementation Snapshot</w:t>
+      </w:r>
+    </w:p>
+    <w:p>
+      <w:pPr>
+        <w:pStyle w:val="FirstParagraph"/>
+      </w:pPr>
+      <w:r>
+        <w:t xml:space="preserve">This summary is slide-ready: it states the quality attribute, the concrete tactic/implementation used in NovelHub, and the requirement or decision it supports.</w:t>
+      </w:r>
+    </w:p>
+    <w:tbl>
+      <w:tblPr>
+        <w:tblStyle w:val="Table"/>
+        <w:tblW w:type="pct" w:w="5000"/>
+        <w:tblLayout w:type="fixed"/>
+        <w:tblLook w:firstRow="1" w:lastRow="0" w:firstColumn="0" w:lastColumn="0" w:noHBand="0" w:noVBand="0" w:val="0020"/>
+      </w:tblPr>
+      <w:tblGrid>
+        <w:gridCol w:w="3420"/>
+        <w:gridCol w:w="4500"/>
+      </w:tblGrid>
+      <w:tr>
+        <w:trPr>
+          <w:tblHeader w:val="on"/>
+        </w:trPr>
+        <w:tc>
+          <w:tcPr/>
+          <w:p>
+            <w:pPr>
+              <w:pStyle w:val="Compact"/>
+            </w:pPr>
+            <w:r>
+              <w:t xml:space="preserve">Quality Attribute</w:t>
+            </w:r>
+          </w:p>
+        </w:tc>
+        <w:tc>
+          <w:tcPr/>
+          <w:p>
+            <w:pPr>
+              <w:pStyle w:val="Compact"/>
+            </w:pPr>
+            <w:r>
+              <w:t xml:space="preserve">How NovelHub Ensures It</w:t>
+            </w:r>
+          </w:p>
+        </w:tc>
+      </w:tr>
+      <w:tr>
+        <w:tc>
+          <w:tcPr/>
+          <w:p>
+            <w:pPr>
+              <w:pStyle w:val="Compact"/>
+            </w:pPr>
+            <w:r>
+              <w:t xml:space="preserve">Performance</w:t>
+            </w:r>
+          </w:p>
+        </w:tc>
+        <w:tc>
+          <w:tcPr/>
+          <w:p>
+            <w:pPr>
+              <w:pStyle w:val="Compact"/>
+            </w:pPr>
+            <w:r>
+              <w:t xml:space="preserve">Achieves fast chapter reading and search by using React Server Components for chapter pages (T-01), edge/CDN caching for public reads (T-02), Cloudinary image optimization (T-03), and Meilisearch for typo-tolerant search under the 500 ms target (T-09). Supports UC-09 and UC-10.</w:t>
+            </w:r>
+          </w:p>
+        </w:tc>
+      </w:tr>
+      <w:tr>
+        <w:tc>
+          <w:tcPr/>
+          <w:p>
+            <w:pPr>
+              <w:pStyle w:val="Compact"/>
+            </w:pPr>
+            <w:r>
+              <w:t xml:space="preserve">Security</w:t>
+            </w:r>
+          </w:p>
+        </w:tc>
+        <w:tc>
+          <w:tcPr/>
+          <w:p>
+            <w:pPr>
+              <w:pStyle w:val="Compact"/>
+            </w:pPr>
+            <w:r>
+              <w:t xml:space="preserve">Protects accounts, VIP content, and payment flow with Better Auth httpOnly sessions (T-05), server-side VIP access checks before rendering chapter content, role checks for curator/admin routes, server-side sanitization (T-12), and MoMo HMAC-SHA256 verification before any coin mutation (T-08). Supports UC-02, UC-09, UC-17, UC-18, UC-21, and UC-23.</w:t>
+            </w:r>
+          </w:p>
+        </w:tc>
+      </w:tr>
+      <w:tr>
+        <w:tc>
+          <w:tcPr/>
+          <w:p>
+            <w:pPr>
+              <w:pStyle w:val="Compact"/>
+            </w:pPr>
+            <w:r>
+              <w:t xml:space="preserve">Reliability</w:t>
+            </w:r>
+          </w:p>
+        </w:tc>
+        <w:tc>
+          <w:tcPr/>
+          <w:p>
+            <w:pPr>
+              <w:pStyle w:val="Compact"/>
+            </w:pPr>
+            <w:r>
+              <w:t xml:space="preserve">Preserves financial correctness through Drizzle</w:t>
+            </w:r>
+            <w:r>
+              <w:t xml:space="preserve"> </w:t>
+            </w:r>
+            <w:r>
+              <w:rPr>
+                <w:rStyle w:val="VerbatimChar"/>
+              </w:rPr>
+              <w:t xml:space="preserve">db.transaction()</w:t>
+            </w:r>
+            <w:r>
+              <w:t xml:space="preserve"> </w:t>
+            </w:r>
+            <w:r>
+              <w:t xml:space="preserve">for coin debit/unlock/ledger writes (T-06),</w:t>
+            </w:r>
+            <w:r>
+              <w:t xml:space="preserve"> </w:t>
+            </w:r>
+            <w:r>
+              <w:rPr>
+                <w:rStyle w:val="VerbatimChar"/>
+              </w:rPr>
+              <w:t xml:space="preserve">SELECT ... FOR UPDATE</w:t>
+            </w:r>
+            <w:r>
+              <w:t xml:space="preserve"> </w:t>
+            </w:r>
+            <w:r>
+              <w:t xml:space="preserve">on</w:t>
+            </w:r>
+            <w:r>
+              <w:t xml:space="preserve"> </w:t>
+            </w:r>
+            <w:r>
+              <w:rPr>
+                <w:rStyle w:val="VerbatimChar"/>
+              </w:rPr>
+              <w:t xml:space="preserve">users.coin_balance</w:t>
+            </w:r>
+            <w:r>
+              <w:t xml:space="preserve"> </w:t>
+            </w:r>
+            <w:r>
+              <w:t xml:space="preserve">for concurrent unlocks (T-07), and idempotent payment processing so repeated webhooks credit coins once (T-08). Supports UC-17 and UC-18.</w:t>
+            </w:r>
+          </w:p>
+        </w:tc>
+      </w:tr>
+      <w:tr>
+        <w:tc>
+          <w:tcPr/>
+          <w:p>
+            <w:pPr>
+              <w:pStyle w:val="Compact"/>
+            </w:pPr>
+            <w:r>
+              <w:t xml:space="preserve">Availability</w:t>
+            </w:r>
+          </w:p>
+        </w:tc>
+        <w:tc>
+          <w:tcPr/>
+          <w:p>
+            <w:pPr>
+              <w:pStyle w:val="Compact"/>
+            </w:pPr>
+            <w:r>
+              <w:t xml:space="preserve">Keeps public reading and search usable during partial outages through CDN stale serving for free chapters (T-02), stateless serverless function replacement, and database fallback when Meilisearch is unavailable (T-10). Supports UC-09 and UC-10.</w:t>
+            </w:r>
+          </w:p>
+        </w:tc>
+      </w:tr>
+      <w:tr>
+        <w:tc>
+          <w:tcPr/>
+          <w:p>
+            <w:pPr>
+              <w:pStyle w:val="Compact"/>
+            </w:pPr>
+            <w:r>
+              <w:t xml:space="preserve">Modifiability</w:t>
+            </w:r>
+          </w:p>
+        </w:tc>
+        <w:tc>
+          <w:tcPr/>
+          <w:p>
+            <w:pPr>
+              <w:pStyle w:val="Compact"/>
+            </w:pPr>
+            <w:r>
+              <w:t xml:space="preserve">Keeps the full-stack monolith changeable through a 4-layer structure and feature modules under</w:t>
+            </w:r>
+            <w:r>
+              <w:t xml:space="preserve"> </w:t>
+            </w:r>
+            <w:r>
+              <w:rPr>
+                <w:rStyle w:val="VerbatimChar"/>
+              </w:rPr>
+              <w:t xml:space="preserve">src/modules/</w:t>
+            </w:r>
+            <w:r>
+              <w:t xml:space="preserve">; payment and search providers are isolated behind module service functions, so changes stay inside the owning module. Supports AD-D-04, AD-D-07, and UC-17/UC-10 evolution.</w:t>
+            </w:r>
+          </w:p>
+        </w:tc>
+      </w:tr>
+    </w:tbl>
+    <w:bookmarkEnd w:id="11"/>
+    <w:bookmarkStart w:id="17" w:name="security"/>
+    <w:p>
+      <w:pPr>
+        <w:pStyle w:val="Heading2"/>
+      </w:pPr>
+      <w:r>
         <w:t xml:space="preserve">2.1 Security</w:t>
       </w:r>
     </w:p>
-    <w:bookmarkStart w:id="11" w:name="authentication-and-authorization"/>
+    <w:bookmarkStart w:id="12" w:name="authentication-and-authorization"/>
     <w:p>
       <w:pPr>
         <w:pStyle w:val="Heading3"/>
@@ -643,8 +851,8 @@
         </w:tc>
       </w:tr>
     </w:tbl>
-    <w:bookmarkEnd w:id="11"/>
-    <w:bookmarkStart w:id="12" w:name="vip-content-protection"/>
+    <w:bookmarkEnd w:id="12"/>
+    <w:bookmarkStart w:id="13" w:name="vip-content-protection"/>
     <w:p>
       <w:pPr>
         <w:pStyle w:val="Heading3"/>
@@ -886,8 +1094,8 @@
         </w:tc>
       </w:tr>
     </w:tbl>
-    <w:bookmarkEnd w:id="12"/>
-    <w:bookmarkStart w:id="13" w:name="payment-webhook-integrity"/>
+    <w:bookmarkEnd w:id="13"/>
+    <w:bookmarkStart w:id="14" w:name="payment-webhook-integrity"/>
     <w:p>
       <w:pPr>
         <w:pStyle w:val="Heading3"/>
@@ -1132,8 +1340,8 @@
         </w:tc>
       </w:tr>
     </w:tbl>
-    <w:bookmarkEnd w:id="13"/>
-    <w:bookmarkStart w:id="14" w:name="brute-force-login-protection"/>
+    <w:bookmarkEnd w:id="14"/>
+    <w:bookmarkStart w:id="15" w:name="brute-force-login-protection"/>
     <w:p>
       <w:pPr>
         <w:pStyle w:val="Heading3"/>
@@ -1405,8 +1613,8 @@
         </w:tc>
       </w:tr>
     </w:tbl>
-    <w:bookmarkEnd w:id="14"/>
-    <w:bookmarkStart w:id="15" w:name="curator-content-sanitization"/>
+    <w:bookmarkEnd w:id="15"/>
+    <w:bookmarkStart w:id="16" w:name="curator-content-sanitization"/>
     <w:p>
       <w:pPr>
         <w:pStyle w:val="Heading3"/>
@@ -1723,9 +1931,9 @@
         </w:tc>
       </w:tr>
     </w:tbl>
-    <w:bookmarkEnd w:id="15"/>
     <w:bookmarkEnd w:id="16"/>
-    <w:bookmarkStart w:id="20" w:name="performance"/>
+    <w:bookmarkEnd w:id="17"/>
+    <w:bookmarkStart w:id="21" w:name="performance"/>
     <w:p>
       <w:pPr>
         <w:pStyle w:val="Heading2"/>
@@ -1734,7 +1942,7 @@
         <w:t xml:space="preserve">2.2 Performance</w:t>
       </w:r>
     </w:p>
-    <w:bookmarkStart w:id="17" w:name="free-chapter-read-latency"/>
+    <w:bookmarkStart w:id="18" w:name="free-chapter-read-latency"/>
     <w:p>
       <w:pPr>
         <w:pStyle w:val="Heading3"/>
@@ -2000,8 +2208,8 @@
         </w:tc>
       </w:tr>
     </w:tbl>
-    <w:bookmarkEnd w:id="17"/>
-    <w:bookmarkStart w:id="18" w:name="novel-browse-page-seo-response"/>
+    <w:bookmarkEnd w:id="18"/>
+    <w:bookmarkStart w:id="19" w:name="novel-browse-page-seo-response"/>
     <w:p>
       <w:pPr>
         <w:pStyle w:val="Heading3"/>
@@ -2369,8 +2577,8 @@
         </w:tc>
       </w:tr>
     </w:tbl>
-    <w:bookmarkEnd w:id="18"/>
-    <w:bookmarkStart w:id="19" w:name="search-response-time"/>
+    <w:bookmarkEnd w:id="19"/>
+    <w:bookmarkStart w:id="20" w:name="search-response-time"/>
     <w:p>
       <w:pPr>
         <w:pStyle w:val="Heading3"/>
@@ -2630,9 +2838,9 @@
         </w:tc>
       </w:tr>
     </w:tbl>
-    <w:bookmarkEnd w:id="19"/>
     <w:bookmarkEnd w:id="20"/>
-    <w:bookmarkStart w:id="24" w:name="reliability"/>
+    <w:bookmarkEnd w:id="21"/>
+    <w:bookmarkStart w:id="25" w:name="reliability"/>
     <w:p>
       <w:pPr>
         <w:pStyle w:val="Heading2"/>
@@ -2641,7 +2849,7 @@
         <w:t xml:space="preserve">2.3 Reliability</w:t>
       </w:r>
     </w:p>
-    <w:bookmarkStart w:id="21" w:name="coin-balance-integrity"/>
+    <w:bookmarkStart w:id="22" w:name="coin-balance-integrity"/>
     <w:p>
       <w:pPr>
         <w:pStyle w:val="Heading3"/>
@@ -2973,8 +3181,8 @@
         </w:tc>
       </w:tr>
     </w:tbl>
-    <w:bookmarkEnd w:id="21"/>
-    <w:bookmarkStart w:id="22" w:name="momo-webhook-idempotency"/>
+    <w:bookmarkEnd w:id="22"/>
+    <w:bookmarkStart w:id="23" w:name="momo-webhook-idempotency"/>
     <w:p>
       <w:pPr>
         <w:pStyle w:val="Heading3"/>
@@ -3279,8 +3487,8 @@
         </w:tc>
       </w:tr>
     </w:tbl>
-    <w:bookmarkEnd w:id="22"/>
-    <w:bookmarkStart w:id="23" w:name="chapter-publish-consistency"/>
+    <w:bookmarkEnd w:id="23"/>
+    <w:bookmarkStart w:id="24" w:name="chapter-publish-consistency"/>
     <w:p>
       <w:pPr>
         <w:pStyle w:val="Heading3"/>
@@ -3516,9 +3724,9 @@
         </w:tc>
       </w:tr>
     </w:tbl>
-    <w:bookmarkEnd w:id="23"/>
     <w:bookmarkEnd w:id="24"/>
-    <w:bookmarkStart w:id="28" w:name="availability"/>
+    <w:bookmarkEnd w:id="25"/>
+    <w:bookmarkStart w:id="29" w:name="availability"/>
     <w:p>
       <w:pPr>
         <w:pStyle w:val="Heading2"/>
@@ -3527,7 +3735,7 @@
         <w:t xml:space="preserve">2.4 Availability</w:t>
       </w:r>
     </w:p>
-    <w:bookmarkStart w:id="25" w:name="X1ed2a12104d8f257f65ffce42abb8b2badcea9e"/>
+    <w:bookmarkStart w:id="26" w:name="X1ed2a12104d8f257f65ffce42abb8b2badcea9e"/>
     <w:p>
       <w:pPr>
         <w:pStyle w:val="Heading3"/>
@@ -3736,8 +3944,8 @@
         </w:tc>
       </w:tr>
     </w:tbl>
-    <w:bookmarkEnd w:id="25"/>
-    <w:bookmarkStart w:id="26" w:name="search-degradation-fallback"/>
+    <w:bookmarkEnd w:id="26"/>
+    <w:bookmarkStart w:id="27" w:name="search-degradation-fallback"/>
     <w:p>
       <w:pPr>
         <w:pStyle w:val="Heading3"/>
@@ -3976,8 +4184,8 @@
         </w:tc>
       </w:tr>
     </w:tbl>
-    <w:bookmarkEnd w:id="26"/>
-    <w:bookmarkStart w:id="27" w:name="serverless-function-fault-isolation"/>
+    <w:bookmarkEnd w:id="27"/>
+    <w:bookmarkStart w:id="28" w:name="serverless-function-fault-isolation"/>
     <w:p>
       <w:pPr>
         <w:pStyle w:val="Heading3"/>
@@ -4177,9 +4385,9 @@
         </w:tc>
       </w:tr>
     </w:tbl>
-    <w:bookmarkEnd w:id="27"/>
     <w:bookmarkEnd w:id="28"/>
-    <w:bookmarkStart w:id="32" w:name="scalability"/>
+    <w:bookmarkEnd w:id="29"/>
+    <w:bookmarkStart w:id="33" w:name="scalability"/>
     <w:p>
       <w:pPr>
         <w:pStyle w:val="Heading2"/>
@@ -4188,7 +4396,7 @@
         <w:t xml:space="preserve">2.5 Scalability</w:t>
       </w:r>
     </w:p>
-    <w:bookmarkStart w:id="29" w:name="concurrent-chapter-read-scalability"/>
+    <w:bookmarkStart w:id="30" w:name="concurrent-chapter-read-scalability"/>
     <w:p>
       <w:pPr>
         <w:pStyle w:val="Heading3"/>
@@ -4388,8 +4596,8 @@
         </w:tc>
       </w:tr>
     </w:tbl>
-    <w:bookmarkEnd w:id="29"/>
-    <w:bookmarkStart w:id="30" w:name="novel-index-growth"/>
+    <w:bookmarkEnd w:id="30"/>
+    <w:bookmarkStart w:id="31" w:name="novel-index-growth"/>
     <w:p>
       <w:pPr>
         <w:pStyle w:val="Heading3"/>
@@ -4640,8 +4848,8 @@
         </w:tc>
       </w:tr>
     </w:tbl>
-    <w:bookmarkEnd w:id="30"/>
-    <w:bookmarkStart w:id="31" w:name="database-connection-scalability"/>
+    <w:bookmarkEnd w:id="31"/>
+    <w:bookmarkStart w:id="32" w:name="database-connection-scalability"/>
     <w:p>
       <w:pPr>
         <w:pStyle w:val="Heading3"/>
@@ -4856,9 +5064,9 @@
         </w:tc>
       </w:tr>
     </w:tbl>
-    <w:bookmarkEnd w:id="31"/>
     <w:bookmarkEnd w:id="32"/>
-    <w:bookmarkStart w:id="37" w:name="modifiability"/>
+    <w:bookmarkEnd w:id="33"/>
+    <w:bookmarkStart w:id="38" w:name="modifiability"/>
     <w:p>
       <w:pPr>
         <w:pStyle w:val="Heading2"/>
@@ -4867,7 +5075,7 @@
         <w:t xml:space="preserve">2.6 Modifiability</w:t>
       </w:r>
     </w:p>
-    <w:bookmarkStart w:id="33" w:name="payment-gateway-replacement"/>
+    <w:bookmarkStart w:id="34" w:name="payment-gateway-replacement"/>
     <w:p>
       <w:pPr>
         <w:pStyle w:val="Heading3"/>
@@ -5142,8 +5350,8 @@
         </w:tc>
       </w:tr>
     </w:tbl>
-    <w:bookmarkEnd w:id="33"/>
-    <w:bookmarkStart w:id="34" w:name="search-provider-replacement"/>
+    <w:bookmarkEnd w:id="34"/>
+    <w:bookmarkStart w:id="35" w:name="search-provider-replacement"/>
     <w:p>
       <w:pPr>
         <w:pStyle w:val="Heading3"/>
@@ -5445,8 +5653,8 @@
         </w:tc>
       </w:tr>
     </w:tbl>
-    <w:bookmarkEnd w:id="34"/>
-    <w:bookmarkStart w:id="35" w:name="auth-provider-replacement"/>
+    <w:bookmarkEnd w:id="35"/>
+    <w:bookmarkStart w:id="36" w:name="auth-provider-replacement"/>
     <w:p>
       <w:pPr>
         <w:pStyle w:val="Heading3"/>
@@ -5850,8 +6058,8 @@
         </w:tc>
       </w:tr>
     </w:tbl>
-    <w:bookmarkEnd w:id="35"/>
-    <w:bookmarkStart w:id="36" w:name="feature-module-independence"/>
+    <w:bookmarkEnd w:id="36"/>
+    <w:bookmarkStart w:id="37" w:name="feature-module-independence"/>
     <w:p>
       <w:pPr>
         <w:pStyle w:val="Heading3"/>
@@ -6159,10 +6367,10 @@
         </w:tc>
       </w:tr>
     </w:tbl>
-    <w:bookmarkEnd w:id="36"/>
     <w:bookmarkEnd w:id="37"/>
     <w:bookmarkEnd w:id="38"/>
-    <w:bookmarkStart w:id="61" w:name="architectural-representation"/>
+    <w:bookmarkEnd w:id="39"/>
+    <w:bookmarkStart w:id="62" w:name="architectural-representation"/>
     <w:p>
       <w:pPr>
         <w:pStyle w:val="Heading1"/>
@@ -6207,7 +6415,7 @@
         <w:t xml:space="preserve">).</w:t>
       </w:r>
     </w:p>
-    <w:bookmarkStart w:id="45" w:name="logical-view"/>
+    <w:bookmarkStart w:id="46" w:name="logical-view"/>
     <w:p>
       <w:pPr>
         <w:pStyle w:val="Heading2"/>
@@ -6245,18 +6453,18 @@
           <wp:inline>
             <wp:extent cx="5334000" cy="3075695"/>
             <wp:effectExtent b="0" l="0" r="0" t="0"/>
-            <wp:docPr descr="Figure 1: NovelHub Layered Architecture" title="" id="40" name="Picture"/>
+            <wp:docPr descr="Figure 1: NovelHub Layered Architecture" title="" id="41" name="Picture"/>
             <a:graphic>
               <a:graphicData uri="http://schemas.openxmlformats.org/drawingml/2006/picture">
                 <pic:pic>
                   <pic:nvPicPr>
-                    <pic:cNvPr descr="figures/sad-01-layers.png" id="41" name="Picture"/>
+                    <pic:cNvPr descr="figures/sad-01-layers.png" id="42" name="Picture"/>
                     <pic:cNvPicPr>
                       <a:picLocks noChangeArrowheads="1" noChangeAspect="1"/>
                     </pic:cNvPicPr>
                   </pic:nvPicPr>
                   <pic:blipFill>
-                    <a:blip r:embed="rId39"/>
+                    <a:blip r:embed="rId40"/>
                     <a:stretch>
                       <a:fillRect/>
                     </a:stretch>
@@ -6520,18 +6728,18 @@
           <wp:inline>
             <wp:extent cx="5334000" cy="3048000"/>
             <wp:effectExtent b="0" l="0" r="0" t="0"/>
-            <wp:docPr descr="Figure 2: Module Boundaries &amp; Schema Ownership" title="" id="43" name="Picture"/>
+            <wp:docPr descr="Figure 2: Module Boundaries &amp; Schema Ownership" title="" id="44" name="Picture"/>
             <a:graphic>
               <a:graphicData uri="http://schemas.openxmlformats.org/drawingml/2006/picture">
                 <pic:pic>
                   <pic:nvPicPr>
-                    <pic:cNvPr descr="figures/sad-02-modules.png" id="44" name="Picture"/>
+                    <pic:cNvPr descr="figures/sad-02-modules.png" id="45" name="Picture"/>
                     <pic:cNvPicPr>
                       <a:picLocks noChangeArrowheads="1" noChangeAspect="1"/>
                     </pic:cNvPicPr>
                   </pic:nvPicPr>
                   <pic:blipFill>
-                    <a:blip r:embed="rId42"/>
+                    <a:blip r:embed="rId43"/>
                     <a:stretch>
                       <a:fillRect/>
                     </a:stretch>
@@ -6574,8 +6782,8 @@
         <w:t xml:space="preserve">Modules in the Application layer do not import from each other. Cross-module interaction is exclusively through exported service function calls.</w:t>
       </w:r>
     </w:p>
-    <w:bookmarkEnd w:id="45"/>
-    <w:bookmarkStart w:id="49" w:name="implementation-view"/>
+    <w:bookmarkEnd w:id="46"/>
+    <w:bookmarkStart w:id="50" w:name="implementation-view"/>
     <w:p>
       <w:pPr>
         <w:pStyle w:val="Heading2"/>
@@ -6601,18 +6809,18 @@
           <wp:inline>
             <wp:extent cx="5334000" cy="3293731"/>
             <wp:effectExtent b="0" l="0" r="0" t="0"/>
-            <wp:docPr descr="Figure 5: Implementation View — Source Directory Structure" title="" id="47" name="Picture"/>
+            <wp:docPr descr="Figure 5: Implementation View — Source Directory Structure" title="" id="48" name="Picture"/>
             <a:graphic>
               <a:graphicData uri="http://schemas.openxmlformats.org/drawingml/2006/picture">
                 <pic:pic>
                   <pic:nvPicPr>
-                    <pic:cNvPr descr="figures/add-01-impl.png" id="48" name="Picture"/>
+                    <pic:cNvPr descr="figures/add-01-impl.png" id="49" name="Picture"/>
                     <pic:cNvPicPr>
                       <a:picLocks noChangeArrowheads="1" noChangeAspect="1"/>
                     </pic:cNvPicPr>
                   </pic:nvPicPr>
                   <pic:blipFill>
-                    <a:blip r:embed="rId46"/>
+                    <a:blip r:embed="rId47"/>
                     <a:stretch>
                       <a:fillRect/>
                     </a:stretch>
@@ -6782,8 +6990,8 @@
         <w:t xml:space="preserve">is never cached in Redis or any in-memory store (DC-05)</w:t>
       </w:r>
     </w:p>
-    <w:bookmarkEnd w:id="49"/>
-    <w:bookmarkStart w:id="56" w:name="deployment-view"/>
+    <w:bookmarkEnd w:id="50"/>
+    <w:bookmarkStart w:id="57" w:name="deployment-view"/>
     <w:p>
       <w:pPr>
         <w:pStyle w:val="Heading2"/>
@@ -6853,18 +7061,18 @@
           <wp:inline>
             <wp:extent cx="5334000" cy="2542654"/>
             <wp:effectExtent b="0" l="0" r="0" t="0"/>
-            <wp:docPr descr="Figure 3: Deployment View V1 — Vercel Hobby" title="" id="51" name="Picture"/>
+            <wp:docPr descr="Figure 3: Deployment View V1 — Vercel Hobby" title="" id="52" name="Picture"/>
             <a:graphic>
               <a:graphicData uri="http://schemas.openxmlformats.org/drawingml/2006/picture">
                 <pic:pic>
                   <pic:nvPicPr>
-                    <pic:cNvPr descr="figures/sad-04-deploy-v1.png" id="52" name="Picture"/>
+                    <pic:cNvPr descr="figures/sad-04-deploy-v1.png" id="53" name="Picture"/>
                     <pic:cNvPicPr>
                       <a:picLocks noChangeArrowheads="1" noChangeAspect="1"/>
                     </pic:cNvPicPr>
                   </pic:nvPicPr>
                   <pic:blipFill>
-                    <a:blip r:embed="rId50"/>
+                    <a:blip r:embed="rId51"/>
                     <a:stretch>
                       <a:fillRect/>
                     </a:stretch>
@@ -7181,18 +7389,18 @@
           <wp:inline>
             <wp:extent cx="5334000" cy="3034651"/>
             <wp:effectExtent b="0" l="0" r="0" t="0"/>
-            <wp:docPr descr="Figure 4: Deployment View V2 — Production" title="" id="54" name="Picture"/>
+            <wp:docPr descr="Figure 4: Deployment View V2 — Production" title="" id="55" name="Picture"/>
             <a:graphic>
               <a:graphicData uri="http://schemas.openxmlformats.org/drawingml/2006/picture">
                 <pic:pic>
                   <pic:nvPicPr>
-                    <pic:cNvPr descr="figures/sad-05-deploy-v2.png" id="55" name="Picture"/>
+                    <pic:cNvPr descr="figures/sad-05-deploy-v2.png" id="56" name="Picture"/>
                     <pic:cNvPicPr>
                       <a:picLocks noChangeArrowheads="1" noChangeAspect="1"/>
                     </pic:cNvPicPr>
                   </pic:nvPicPr>
                   <pic:blipFill>
-                    <a:blip r:embed="rId53"/>
+                    <a:blip r:embed="rId54"/>
                     <a:stretch>
                       <a:fillRect/>
                     </a:stretch>
@@ -7496,8 +7704,8 @@
         <w:t xml:space="preserve">V1 → V2 migration trigger: &gt; 500 DAU, OR payment go-live decision, OR Neon free tier (0.5 GB) exhausted.</w:t>
       </w:r>
     </w:p>
-    <w:bookmarkEnd w:id="56"/>
-    <w:bookmarkStart w:id="60" w:name="data-view"/>
+    <w:bookmarkEnd w:id="57"/>
+    <w:bookmarkStart w:id="61" w:name="data-view"/>
     <w:p>
       <w:pPr>
         <w:pStyle w:val="Heading2"/>
@@ -7539,18 +7747,18 @@
           <wp:inline>
             <wp:extent cx="5334000" cy="3189732"/>
             <wp:effectExtent b="0" l="0" r="0" t="0"/>
-            <wp:docPr descr="Figure 6: Data View — Entity Relationship Diagram" title="" id="58" name="Picture"/>
+            <wp:docPr descr="Figure 6: Data View — Entity Relationship Diagram" title="" id="59" name="Picture"/>
             <a:graphic>
               <a:graphicData uri="http://schemas.openxmlformats.org/drawingml/2006/picture">
                 <pic:pic>
                   <pic:nvPicPr>
-                    <pic:cNvPr descr="figures/add-02-erd.png" id="59" name="Picture"/>
+                    <pic:cNvPr descr="figures/add-02-erd.png" id="60" name="Picture"/>
                     <pic:cNvPicPr>
                       <a:picLocks noChangeArrowheads="1" noChangeAspect="1"/>
                     </pic:cNvPicPr>
                   </pic:nvPicPr>
                   <pic:blipFill>
-                    <a:blip r:embed="rId57"/>
+                    <a:blip r:embed="rId58"/>
                     <a:stretch>
                       <a:fillRect/>
                     </a:stretch>
@@ -8485,9 +8693,9 @@
         <w:t xml:space="preserve">.</w:t>
       </w:r>
     </w:p>
-    <w:bookmarkEnd w:id="60"/>
     <w:bookmarkEnd w:id="61"/>
-    <w:bookmarkStart w:id="62" w:name="qa-driver-summary"/>
+    <w:bookmarkEnd w:id="62"/>
+    <w:bookmarkStart w:id="63" w:name="qa-driver-summary"/>
     <w:p>
       <w:pPr>
         <w:pStyle w:val="Heading1"/>
@@ -8501,7 +8709,7 @@
         <w:pStyle w:val="FirstParagraph"/>
       </w:pPr>
       <w:r>
-        <w:t xml:space="preserve">This table cross-references each QA scenario in this document with the corresponding architectural tactics and decisions documented in the SAD (v1.0), and the Behavior View packets that demonstrate them.</w:t>
+        <w:t xml:space="preserve">This table cross-references each QA scenario in this document with the corresponding architectural tactics and decisions documented in the SAD (v1.0), the Behavior View packets that demonstrate them, and the verification evidence used by the RTM. In the presentation, this is the bridge between Slide 5 (Quality Drivers), Slide 8 (Architecture Decisions), Slide 9 (VIP Unlock), and Slide 11 (Verification With RTM).</w:t>
       </w:r>
     </w:p>
     <w:tbl>
@@ -8512,11 +8720,12 @@
         <w:tblLook w:firstRow="1" w:lastRow="0" w:firstColumn="0" w:lastColumn="0" w:noHBand="0" w:noVBand="0" w:val="0020"/>
       </w:tblPr>
       <w:tblGrid>
-        <w:gridCol w:w="977"/>
-        <w:gridCol w:w="1564"/>
-        <w:gridCol w:w="2346"/>
-        <w:gridCol w:w="1368"/>
-        <w:gridCol w:w="1662"/>
+        <w:gridCol w:w="654"/>
+        <w:gridCol w:w="1047"/>
+        <w:gridCol w:w="1570"/>
+        <w:gridCol w:w="916"/>
+        <w:gridCol w:w="1112"/>
+        <w:gridCol w:w="2618"/>
       </w:tblGrid>
       <w:tr>
         <w:trPr>
@@ -8577,6 +8786,17 @@
             </w:r>
           </w:p>
         </w:tc>
+        <w:tc>
+          <w:tcPr/>
+          <w:p>
+            <w:pPr>
+              <w:pStyle w:val="Compact"/>
+            </w:pPr>
+            <w:r>
+              <w:t xml:space="preserve">Implementation / Verification Evidence</w:t>
+            </w:r>
+          </w:p>
+        </w:tc>
       </w:tr>
       <w:tr>
         <w:tc>
@@ -8634,6 +8854,56 @@
             </w:r>
           </w:p>
         </w:tc>
+        <w:tc>
+          <w:tcPr/>
+          <w:p>
+            <w:pPr>
+              <w:pStyle w:val="Compact"/>
+            </w:pPr>
+            <w:r>
+              <w:rPr>
+                <w:rStyle w:val="VerbatimChar"/>
+              </w:rPr>
+              <w:t xml:space="preserve">src/middleware.ts</w:t>
+            </w:r>
+            <w:r>
+              <w:t xml:space="preserve">,</w:t>
+            </w:r>
+            <w:r>
+              <w:t xml:space="preserve"> </w:t>
+            </w:r>
+            <w:r>
+              <w:rPr>
+                <w:rStyle w:val="VerbatimChar"/>
+              </w:rPr>
+              <w:t xml:space="preserve">src/lib/auth.ts</w:t>
+            </w:r>
+            <w:r>
+              <w:t xml:space="preserve">;</w:t>
+            </w:r>
+            <w:r>
+              <w:t xml:space="preserve"> </w:t>
+            </w:r>
+            <w:r>
+              <w:rPr>
+                <w:rStyle w:val="VerbatimChar"/>
+              </w:rPr>
+              <w:t xml:space="preserve">tests/e2e/auth-gates.spec.ts</w:t>
+            </w:r>
+            <w:r>
+              <w:t xml:space="preserve">,</w:t>
+            </w:r>
+            <w:r>
+              <w:t xml:space="preserve"> </w:t>
+            </w:r>
+            <w:r>
+              <w:rPr>
+                <w:rStyle w:val="VerbatimChar"/>
+              </w:rPr>
+              <w:t xml:space="preserve">tests/api/auth-api.spec.ts</w:t>
+            </w:r>
+          </w:p>
+        </w:tc>
       </w:tr>
       <w:tr>
         <w:tc>
@@ -8691,6 +8961,38 @@
             </w:r>
           </w:p>
         </w:tc>
+        <w:tc>
+          <w:tcPr/>
+          <w:p>
+            <w:pPr>
+              <w:pStyle w:val="Compact"/>
+            </w:pPr>
+            <w:r>
+              <w:t xml:space="preserve">Chapter page server-side access check;</w:t>
+            </w:r>
+            <w:r>
+              <w:t xml:space="preserve"> </w:t>
+            </w:r>
+            <w:r>
+              <w:rPr>
+                <w:rStyle w:val="VerbatimChar"/>
+              </w:rPr>
+              <w:t xml:space="preserve">tests/e2e/reader-ui.spec.ts</w:t>
+            </w:r>
+            <w:r>
+              <w:t xml:space="preserve">,</w:t>
+            </w:r>
+            <w:r>
+              <w:t xml:space="preserve"> </w:t>
+            </w:r>
+            <w:r>
+              <w:rPr>
+                <w:rStyle w:val="VerbatimChar"/>
+              </w:rPr>
+              <w:t xml:space="preserve">tests/api/payments-api.spec.ts</w:t>
+            </w:r>
+          </w:p>
+        </w:tc>
       </w:tr>
       <w:tr>
         <w:tc>
@@ -8748,6 +9050,32 @@
             </w:r>
           </w:p>
         </w:tc>
+        <w:tc>
+          <w:tcPr/>
+          <w:p>
+            <w:pPr>
+              <w:pStyle w:val="Compact"/>
+            </w:pPr>
+            <w:r>
+              <w:rPr>
+                <w:rStyle w:val="VerbatimChar"/>
+              </w:rPr>
+              <w:t xml:space="preserve">src/modules/monetization/services/momo.service.ts</w:t>
+            </w:r>
+            <w:r>
+              <w:t xml:space="preserve">;</w:t>
+            </w:r>
+            <w:r>
+              <w:t xml:space="preserve"> </w:t>
+            </w:r>
+            <w:r>
+              <w:rPr>
+                <w:rStyle w:val="VerbatimChar"/>
+              </w:rPr>
+              <w:t xml:space="preserve">tests/api/payments-api.spec.ts</w:t>
+            </w:r>
+          </w:p>
+        </w:tc>
       </w:tr>
       <w:tr>
         <w:tc>
@@ -8805,6 +9133,38 @@
             </w:r>
           </w:p>
         </w:tc>
+        <w:tc>
+          <w:tcPr/>
+          <w:p>
+            <w:pPr>
+              <w:pStyle w:val="Compact"/>
+            </w:pPr>
+            <w:r>
+              <w:t xml:space="preserve">Better Auth sign-in flow and user lock fields;</w:t>
+            </w:r>
+            <w:r>
+              <w:t xml:space="preserve"> </w:t>
+            </w:r>
+            <w:r>
+              <w:rPr>
+                <w:rStyle w:val="VerbatimChar"/>
+              </w:rPr>
+              <w:t xml:space="preserve">tests/api/auth-api.spec.ts</w:t>
+            </w:r>
+            <w:r>
+              <w:t xml:space="preserve">,</w:t>
+            </w:r>
+            <w:r>
+              <w:t xml:space="preserve"> </w:t>
+            </w:r>
+            <w:r>
+              <w:rPr>
+                <w:rStyle w:val="VerbatimChar"/>
+              </w:rPr>
+              <w:t xml:space="preserve">tests/e2e/auth.spec.ts</w:t>
+            </w:r>
+          </w:p>
+        </w:tc>
       </w:tr>
       <w:tr>
         <w:tc>
@@ -8862,6 +9222,38 @@
             </w:r>
           </w:p>
         </w:tc>
+        <w:tc>
+          <w:tcPr/>
+          <w:p>
+            <w:pPr>
+              <w:pStyle w:val="Compact"/>
+            </w:pPr>
+            <w:r>
+              <w:t xml:space="preserve">Chapter/comment save paths;</w:t>
+            </w:r>
+            <w:r>
+              <w:t xml:space="preserve"> </w:t>
+            </w:r>
+            <w:r>
+              <w:rPr>
+                <w:rStyle w:val="VerbatimChar"/>
+              </w:rPr>
+              <w:t xml:space="preserve">tests/e2e/curator-ui.spec.ts</w:t>
+            </w:r>
+            <w:r>
+              <w:t xml:space="preserve">,</w:t>
+            </w:r>
+            <w:r>
+              <w:t xml:space="preserve"> </w:t>
+            </w:r>
+            <w:r>
+              <w:rPr>
+                <w:rStyle w:val="VerbatimChar"/>
+              </w:rPr>
+              <w:t xml:space="preserve">tests/e2e/observability-ui.spec.ts</w:t>
+            </w:r>
+          </w:p>
+        </w:tc>
       </w:tr>
       <w:tr>
         <w:tc>
@@ -8919,6 +9311,38 @@
             </w:r>
           </w:p>
         </w:tc>
+        <w:tc>
+          <w:tcPr/>
+          <w:p>
+            <w:pPr>
+              <w:pStyle w:val="Compact"/>
+            </w:pPr>
+            <w:r>
+              <w:t xml:space="preserve">RSC chapter reader, CDN/image configuration;</w:t>
+            </w:r>
+            <w:r>
+              <w:t xml:space="preserve"> </w:t>
+            </w:r>
+            <w:r>
+              <w:rPr>
+                <w:rStyle w:val="VerbatimChar"/>
+              </w:rPr>
+              <w:t xml:space="preserve">tests/e2e/reader-ui.spec.ts</w:t>
+            </w:r>
+            <w:r>
+              <w:t xml:space="preserve">,</w:t>
+            </w:r>
+            <w:r>
+              <w:t xml:space="preserve"> </w:t>
+            </w:r>
+            <w:r>
+              <w:rPr>
+                <w:rStyle w:val="VerbatimChar"/>
+              </w:rPr>
+              <w:t xml:space="preserve">tests/api/nfr-api.spec.ts</w:t>
+            </w:r>
+          </w:p>
+        </w:tc>
       </w:tr>
       <w:tr>
         <w:tc>
@@ -8939,6 +9363,104 @@
               <w:pStyle w:val="Compact"/>
             </w:pPr>
             <w:r>
+              <w:t xml:space="preserve">SEO / Indexability</w:t>
+            </w:r>
+          </w:p>
+        </w:tc>
+        <w:tc>
+          <w:tcPr/>
+          <w:p>
+            <w:pPr>
+              <w:pStyle w:val="Compact"/>
+            </w:pPr>
+            <w:r>
+              <w:t xml:space="preserve">T-11 (generateMetadata)</w:t>
+            </w:r>
+          </w:p>
+        </w:tc>
+        <w:tc>
+          <w:tcPr/>
+          <w:p>
+            <w:pPr>
+              <w:pStyle w:val="Compact"/>
+            </w:pPr>
+            <w:r>
+              <w:t xml:space="preserve">AD-D-01</w:t>
+            </w:r>
+          </w:p>
+        </w:tc>
+        <w:tc>
+          <w:tcPr/>
+          <w:p>
+            <w:pPr>
+              <w:pStyle w:val="Compact"/>
+            </w:pPr>
+            <w:r>
+              <w:t xml:space="preserve">VP-7.4</w:t>
+            </w:r>
+          </w:p>
+        </w:tc>
+        <w:tc>
+          <w:tcPr/>
+          <w:p>
+            <w:pPr>
+              <w:pStyle w:val="Compact"/>
+            </w:pPr>
+            <w:r>
+              <w:rPr>
+                <w:rStyle w:val="VerbatimChar"/>
+              </w:rPr>
+              <w:t xml:space="preserve">generateMetadata()</w:t>
+            </w:r>
+            <w:r>
+              <w:t xml:space="preserve"> </w:t>
+            </w:r>
+            <w:r>
+              <w:t xml:space="preserve">and sitemap routes;</w:t>
+            </w:r>
+            <w:r>
+              <w:t xml:space="preserve"> </w:t>
+            </w:r>
+            <w:r>
+              <w:rPr>
+                <w:rStyle w:val="VerbatimChar"/>
+              </w:rPr>
+              <w:t xml:space="preserve">tests/api/nfr-api.spec.ts</w:t>
+            </w:r>
+            <w:r>
+              <w:t xml:space="preserve">,</w:t>
+            </w:r>
+            <w:r>
+              <w:t xml:space="preserve"> </w:t>
+            </w:r>
+            <w:r>
+              <w:rPr>
+                <w:rStyle w:val="VerbatimChar"/>
+              </w:rPr>
+              <w:t xml:space="preserve">tests/e2e/novels-ui.spec.ts</w:t>
+            </w:r>
+          </w:p>
+        </w:tc>
+      </w:tr>
+      <w:tr>
+        <w:tc>
+          <w:tcPr/>
+          <w:p>
+            <w:pPr>
+              <w:pStyle w:val="Compact"/>
+            </w:pPr>
+            <w:r>
+              <w:t xml:space="preserve">2.2.3</w:t>
+            </w:r>
+          </w:p>
+        </w:tc>
+        <w:tc>
+          <w:tcPr/>
+          <w:p>
+            <w:pPr>
+              <w:pStyle w:val="Compact"/>
+            </w:pPr>
+            <w:r>
               <w:t xml:space="preserve">Performance</w:t>
             </w:r>
           </w:p>
@@ -8950,7 +9472,354 @@
               <w:pStyle w:val="Compact"/>
             </w:pPr>
             <w:r>
-              <w:t xml:space="preserve">T-11 (generateMetadata)</w:t>
+              <w:t xml:space="preserve">T-09, T-10</w:t>
+            </w:r>
+          </w:p>
+        </w:tc>
+        <w:tc>
+          <w:tcPr/>
+          <w:p>
+            <w:pPr>
+              <w:pStyle w:val="Compact"/>
+            </w:pPr>
+            <w:r>
+              <w:t xml:space="preserve">AD-D-07</w:t>
+            </w:r>
+          </w:p>
+        </w:tc>
+        <w:tc>
+          <w:tcPr/>
+          <w:p>
+            <w:pPr>
+              <w:pStyle w:val="Compact"/>
+            </w:pPr>
+            <w:r>
+              <w:t xml:space="preserve">-</w:t>
+            </w:r>
+          </w:p>
+        </w:tc>
+        <w:tc>
+          <w:tcPr/>
+          <w:p>
+            <w:pPr>
+              <w:pStyle w:val="Compact"/>
+            </w:pPr>
+            <w:r>
+              <w:rPr>
+                <w:rStyle w:val="VerbatimChar"/>
+              </w:rPr>
+              <w:t xml:space="preserve">src/modules/search/services/search.service.ts</w:t>
+            </w:r>
+            <w:r>
+              <w:t xml:space="preserve">;</w:t>
+            </w:r>
+            <w:r>
+              <w:t xml:space="preserve"> </w:t>
+            </w:r>
+            <w:r>
+              <w:rPr>
+                <w:rStyle w:val="VerbatimChar"/>
+              </w:rPr>
+              <w:t xml:space="preserve">tests/e2e/novels-ui.spec.ts</w:t>
+            </w:r>
+            <w:r>
+              <w:t xml:space="preserve">,</w:t>
+            </w:r>
+            <w:r>
+              <w:t xml:space="preserve"> </w:t>
+            </w:r>
+            <w:r>
+              <w:rPr>
+                <w:rStyle w:val="VerbatimChar"/>
+              </w:rPr>
+              <w:t xml:space="preserve">tests/e2e/public.spec.ts</w:t>
+            </w:r>
+          </w:p>
+        </w:tc>
+      </w:tr>
+      <w:tr>
+        <w:tc>
+          <w:tcPr/>
+          <w:p>
+            <w:pPr>
+              <w:pStyle w:val="Compact"/>
+            </w:pPr>
+            <w:r>
+              <w:t xml:space="preserve">2.3.1</w:t>
+            </w:r>
+          </w:p>
+        </w:tc>
+        <w:tc>
+          <w:tcPr/>
+          <w:p>
+            <w:pPr>
+              <w:pStyle w:val="Compact"/>
+            </w:pPr>
+            <w:r>
+              <w:t xml:space="preserve">Reliability</w:t>
+            </w:r>
+          </w:p>
+        </w:tc>
+        <w:tc>
+          <w:tcPr/>
+          <w:p>
+            <w:pPr>
+              <w:pStyle w:val="Compact"/>
+            </w:pPr>
+            <w:r>
+              <w:t xml:space="preserve">T-06, T-07</w:t>
+            </w:r>
+          </w:p>
+        </w:tc>
+        <w:tc>
+          <w:tcPr/>
+          <w:p>
+            <w:pPr>
+              <w:pStyle w:val="Compact"/>
+            </w:pPr>
+            <w:r>
+              <w:t xml:space="preserve">AD-D-03</w:t>
+            </w:r>
+          </w:p>
+        </w:tc>
+        <w:tc>
+          <w:tcPr/>
+          <w:p>
+            <w:pPr>
+              <w:pStyle w:val="Compact"/>
+            </w:pPr>
+            <w:r>
+              <w:t xml:space="preserve">VP-7.2</w:t>
+            </w:r>
+          </w:p>
+        </w:tc>
+        <w:tc>
+          <w:tcPr/>
+          <w:p>
+            <w:pPr>
+              <w:pStyle w:val="Compact"/>
+            </w:pPr>
+            <w:r>
+              <w:rPr>
+                <w:rStyle w:val="VerbatimChar"/>
+              </w:rPr>
+              <w:t xml:space="preserve">unlockChapter()</w:t>
+            </w:r>
+            <w:r>
+              <w:t xml:space="preserve"> </w:t>
+            </w:r>
+            <w:r>
+              <w:t xml:space="preserve">transaction and row lock;</w:t>
+            </w:r>
+            <w:r>
+              <w:t xml:space="preserve"> </w:t>
+            </w:r>
+            <w:r>
+              <w:rPr>
+                <w:rStyle w:val="VerbatimChar"/>
+              </w:rPr>
+              <w:t xml:space="preserve">tests/api/payments-api.spec.ts</w:t>
+            </w:r>
+          </w:p>
+        </w:tc>
+      </w:tr>
+      <w:tr>
+        <w:tc>
+          <w:tcPr/>
+          <w:p>
+            <w:pPr>
+              <w:pStyle w:val="Compact"/>
+            </w:pPr>
+            <w:r>
+              <w:t xml:space="preserve">2.3.2</w:t>
+            </w:r>
+          </w:p>
+        </w:tc>
+        <w:tc>
+          <w:tcPr/>
+          <w:p>
+            <w:pPr>
+              <w:pStyle w:val="Compact"/>
+            </w:pPr>
+            <w:r>
+              <w:t xml:space="preserve">Reliability</w:t>
+            </w:r>
+          </w:p>
+        </w:tc>
+        <w:tc>
+          <w:tcPr/>
+          <w:p>
+            <w:pPr>
+              <w:pStyle w:val="Compact"/>
+            </w:pPr>
+            <w:r>
+              <w:t xml:space="preserve">T-06, T-08</w:t>
+            </w:r>
+          </w:p>
+        </w:tc>
+        <w:tc>
+          <w:tcPr/>
+          <w:p>
+            <w:pPr>
+              <w:pStyle w:val="Compact"/>
+            </w:pPr>
+            <w:r>
+              <w:t xml:space="preserve">AD-D-06</w:t>
+            </w:r>
+          </w:p>
+        </w:tc>
+        <w:tc>
+          <w:tcPr/>
+          <w:p>
+            <w:pPr>
+              <w:pStyle w:val="Compact"/>
+            </w:pPr>
+            <w:r>
+              <w:t xml:space="preserve">VP-7.3</w:t>
+            </w:r>
+          </w:p>
+        </w:tc>
+        <w:tc>
+          <w:tcPr/>
+          <w:p>
+            <w:pPr>
+              <w:pStyle w:val="Compact"/>
+            </w:pPr>
+            <w:r>
+              <w:t xml:space="preserve">MoMo webhook idempotent receiver;</w:t>
+            </w:r>
+            <w:r>
+              <w:t xml:space="preserve"> </w:t>
+            </w:r>
+            <w:r>
+              <w:rPr>
+                <w:rStyle w:val="VerbatimChar"/>
+              </w:rPr>
+              <w:t xml:space="preserve">tests/api/payments-api.spec.ts</w:t>
+            </w:r>
+          </w:p>
+        </w:tc>
+      </w:tr>
+      <w:tr>
+        <w:tc>
+          <w:tcPr/>
+          <w:p>
+            <w:pPr>
+              <w:pStyle w:val="Compact"/>
+            </w:pPr>
+            <w:r>
+              <w:t xml:space="preserve">2.3.3</w:t>
+            </w:r>
+          </w:p>
+        </w:tc>
+        <w:tc>
+          <w:tcPr/>
+          <w:p>
+            <w:pPr>
+              <w:pStyle w:val="Compact"/>
+            </w:pPr>
+            <w:r>
+              <w:t xml:space="preserve">Reliability</w:t>
+            </w:r>
+          </w:p>
+        </w:tc>
+        <w:tc>
+          <w:tcPr/>
+          <w:p>
+            <w:pPr>
+              <w:pStyle w:val="Compact"/>
+            </w:pPr>
+            <w:r>
+              <w:t xml:space="preserve">T-06</w:t>
+            </w:r>
+          </w:p>
+        </w:tc>
+        <w:tc>
+          <w:tcPr/>
+          <w:p>
+            <w:pPr>
+              <w:pStyle w:val="Compact"/>
+            </w:pPr>
+            <w:r>
+              <w:t xml:space="preserve">AD-D-03</w:t>
+            </w:r>
+          </w:p>
+        </w:tc>
+        <w:tc>
+          <w:tcPr/>
+          <w:p>
+            <w:pPr>
+              <w:pStyle w:val="Compact"/>
+            </w:pPr>
+            <w:r>
+              <w:t xml:space="preserve">VP-7.5</w:t>
+            </w:r>
+          </w:p>
+        </w:tc>
+        <w:tc>
+          <w:tcPr/>
+          <w:p>
+            <w:pPr>
+              <w:pStyle w:val="Compact"/>
+            </w:pPr>
+            <w:r>
+              <w:t xml:space="preserve">Chapter publish transaction and post-commit side effects;</w:t>
+            </w:r>
+            <w:r>
+              <w:t xml:space="preserve"> </w:t>
+            </w:r>
+            <w:r>
+              <w:rPr>
+                <w:rStyle w:val="VerbatimChar"/>
+              </w:rPr>
+              <w:t xml:space="preserve">tests/api/curator-api.spec.ts</w:t>
+            </w:r>
+            <w:r>
+              <w:t xml:space="preserve">,</w:t>
+            </w:r>
+            <w:r>
+              <w:t xml:space="preserve"> </w:t>
+            </w:r>
+            <w:r>
+              <w:rPr>
+                <w:rStyle w:val="VerbatimChar"/>
+              </w:rPr>
+              <w:t xml:space="preserve">tests/e2e/curator-ui.spec.ts</w:t>
+            </w:r>
+          </w:p>
+        </w:tc>
+      </w:tr>
+      <w:tr>
+        <w:tc>
+          <w:tcPr/>
+          <w:p>
+            <w:pPr>
+              <w:pStyle w:val="Compact"/>
+            </w:pPr>
+            <w:r>
+              <w:t xml:space="preserve">2.4.1</w:t>
+            </w:r>
+          </w:p>
+        </w:tc>
+        <w:tc>
+          <w:tcPr/>
+          <w:p>
+            <w:pPr>
+              <w:pStyle w:val="Compact"/>
+            </w:pPr>
+            <w:r>
+              <w:t xml:space="preserve">Availability</w:t>
+            </w:r>
+          </w:p>
+        </w:tc>
+        <w:tc>
+          <w:tcPr/>
+          <w:p>
+            <w:pPr>
+              <w:pStyle w:val="Compact"/>
+            </w:pPr>
+            <w:r>
+              <w:t xml:space="preserve">T-02 (CDN cache)</w:t>
             </w:r>
           </w:p>
         </w:tc>
@@ -8976,38 +9845,58 @@
             </w:r>
           </w:p>
         </w:tc>
-      </w:tr>
-      <w:tr>
-        <w:tc>
-          <w:tcPr/>
-          <w:p>
-            <w:pPr>
-              <w:pStyle w:val="Compact"/>
-            </w:pPr>
-            <w:r>
-              <w:t xml:space="preserve">2.2.3</w:t>
-            </w:r>
-          </w:p>
-        </w:tc>
-        <w:tc>
-          <w:tcPr/>
-          <w:p>
-            <w:pPr>
-              <w:pStyle w:val="Compact"/>
-            </w:pPr>
-            <w:r>
-              <w:t xml:space="preserve">Performance</w:t>
-            </w:r>
-          </w:p>
-        </w:tc>
-        <w:tc>
-          <w:tcPr/>
-          <w:p>
-            <w:pPr>
-              <w:pStyle w:val="Compact"/>
-            </w:pPr>
-            <w:r>
-              <w:t xml:space="preserve">T-09, T-10</w:t>
+        <w:tc>
+          <w:tcPr/>
+          <w:p>
+            <w:pPr>
+              <w:pStyle w:val="Compact"/>
+            </w:pPr>
+            <w:r>
+              <w:t xml:space="preserve">Cache headers and edge deployment configuration;</w:t>
+            </w:r>
+            <w:r>
+              <w:t xml:space="preserve"> </w:t>
+            </w:r>
+            <w:r>
+              <w:rPr>
+                <w:rStyle w:val="VerbatimChar"/>
+              </w:rPr>
+              <w:t xml:space="preserve">tests/api/nfr-api.spec.ts</w:t>
+            </w:r>
+          </w:p>
+        </w:tc>
+      </w:tr>
+      <w:tr>
+        <w:tc>
+          <w:tcPr/>
+          <w:p>
+            <w:pPr>
+              <w:pStyle w:val="Compact"/>
+            </w:pPr>
+            <w:r>
+              <w:t xml:space="preserve">2.4.2</w:t>
+            </w:r>
+          </w:p>
+        </w:tc>
+        <w:tc>
+          <w:tcPr/>
+          <w:p>
+            <w:pPr>
+              <w:pStyle w:val="Compact"/>
+            </w:pPr>
+            <w:r>
+              <w:t xml:space="preserve">Availability</w:t>
+            </w:r>
+          </w:p>
+        </w:tc>
+        <w:tc>
+          <w:tcPr/>
+          <w:p>
+            <w:pPr>
+              <w:pStyle w:val="Compact"/>
+            </w:pPr>
+            <w:r>
+              <w:t xml:space="preserve">T-10 (DB fallback)</w:t>
             </w:r>
           </w:p>
         </w:tc>
@@ -9029,145 +9918,318 @@
               <w:pStyle w:val="Compact"/>
             </w:pPr>
             <w:r>
-              <w:t xml:space="preserve">—</w:t>
-            </w:r>
-          </w:p>
-        </w:tc>
-      </w:tr>
-      <w:tr>
-        <w:tc>
-          <w:tcPr/>
-          <w:p>
-            <w:pPr>
-              <w:pStyle w:val="Compact"/>
-            </w:pPr>
-            <w:r>
-              <w:t xml:space="preserve">2.3.1</w:t>
-            </w:r>
-          </w:p>
-        </w:tc>
-        <w:tc>
-          <w:tcPr/>
-          <w:p>
-            <w:pPr>
-              <w:pStyle w:val="Compact"/>
-            </w:pPr>
-            <w:r>
-              <w:t xml:space="preserve">Reliability</w:t>
-            </w:r>
-          </w:p>
-        </w:tc>
-        <w:tc>
-          <w:tcPr/>
-          <w:p>
-            <w:pPr>
-              <w:pStyle w:val="Compact"/>
-            </w:pPr>
-            <w:r>
-              <w:t xml:space="preserve">T-06, T-07</w:t>
-            </w:r>
-          </w:p>
-        </w:tc>
-        <w:tc>
-          <w:tcPr/>
-          <w:p>
-            <w:pPr>
-              <w:pStyle w:val="Compact"/>
-            </w:pPr>
-            <w:r>
-              <w:t xml:space="preserve">AD-D-03</w:t>
-            </w:r>
-          </w:p>
-        </w:tc>
-        <w:tc>
-          <w:tcPr/>
-          <w:p>
-            <w:pPr>
-              <w:pStyle w:val="Compact"/>
-            </w:pPr>
-            <w:r>
-              <w:t xml:space="preserve">VP-7.2</w:t>
-            </w:r>
-          </w:p>
-        </w:tc>
-      </w:tr>
-      <w:tr>
-        <w:tc>
-          <w:tcPr/>
-          <w:p>
-            <w:pPr>
-              <w:pStyle w:val="Compact"/>
-            </w:pPr>
-            <w:r>
-              <w:t xml:space="preserve">2.3.2</w:t>
-            </w:r>
-          </w:p>
-        </w:tc>
-        <w:tc>
-          <w:tcPr/>
-          <w:p>
-            <w:pPr>
-              <w:pStyle w:val="Compact"/>
-            </w:pPr>
-            <w:r>
-              <w:t xml:space="preserve">Reliability</w:t>
-            </w:r>
-          </w:p>
-        </w:tc>
-        <w:tc>
-          <w:tcPr/>
-          <w:p>
-            <w:pPr>
-              <w:pStyle w:val="Compact"/>
-            </w:pPr>
-            <w:r>
-              <w:t xml:space="preserve">T-06, T-08</w:t>
-            </w:r>
-          </w:p>
-        </w:tc>
-        <w:tc>
-          <w:tcPr/>
-          <w:p>
-            <w:pPr>
-              <w:pStyle w:val="Compact"/>
-            </w:pPr>
-            <w:r>
-              <w:t xml:space="preserve">AD-D-06</w:t>
-            </w:r>
-          </w:p>
-        </w:tc>
-        <w:tc>
-          <w:tcPr/>
-          <w:p>
-            <w:pPr>
-              <w:pStyle w:val="Compact"/>
-            </w:pPr>
-            <w:r>
-              <w:t xml:space="preserve">VP-7.3</w:t>
-            </w:r>
-          </w:p>
-        </w:tc>
-      </w:tr>
-      <w:tr>
-        <w:tc>
-          <w:tcPr/>
-          <w:p>
-            <w:pPr>
-              <w:pStyle w:val="Compact"/>
-            </w:pPr>
-            <w:r>
-              <w:t xml:space="preserve">2.3.3</w:t>
-            </w:r>
-          </w:p>
-        </w:tc>
-        <w:tc>
-          <w:tcPr/>
-          <w:p>
-            <w:pPr>
-              <w:pStyle w:val="Compact"/>
-            </w:pPr>
-            <w:r>
-              <w:t xml:space="preserve">Reliability</w:t>
+              <w:t xml:space="preserve">-</w:t>
+            </w:r>
+          </w:p>
+        </w:tc>
+        <w:tc>
+          <w:tcPr/>
+          <w:p>
+            <w:pPr>
+              <w:pStyle w:val="Compact"/>
+            </w:pPr>
+            <w:r>
+              <w:t xml:space="preserve">Search fallback path;</w:t>
+            </w:r>
+            <w:r>
+              <w:t xml:space="preserve"> </w:t>
+            </w:r>
+            <w:r>
+              <w:rPr>
+                <w:rStyle w:val="VerbatimChar"/>
+              </w:rPr>
+              <w:t xml:space="preserve">tests/e2e/novels-ui.spec.ts</w:t>
+            </w:r>
+            <w:r>
+              <w:t xml:space="preserve">,</w:t>
+            </w:r>
+            <w:r>
+              <w:t xml:space="preserve"> </w:t>
+            </w:r>
+            <w:r>
+              <w:rPr>
+                <w:rStyle w:val="VerbatimChar"/>
+              </w:rPr>
+              <w:t xml:space="preserve">tests/e2e/public.spec.ts</w:t>
+            </w:r>
+          </w:p>
+        </w:tc>
+      </w:tr>
+      <w:tr>
+        <w:tc>
+          <w:tcPr/>
+          <w:p>
+            <w:pPr>
+              <w:pStyle w:val="Compact"/>
+            </w:pPr>
+            <w:r>
+              <w:t xml:space="preserve">2.4.3</w:t>
+            </w:r>
+          </w:p>
+        </w:tc>
+        <w:tc>
+          <w:tcPr/>
+          <w:p>
+            <w:pPr>
+              <w:pStyle w:val="Compact"/>
+            </w:pPr>
+            <w:r>
+              <w:t xml:space="preserve">Availability</w:t>
+            </w:r>
+          </w:p>
+        </w:tc>
+        <w:tc>
+          <w:tcPr/>
+          <w:p>
+            <w:pPr>
+              <w:pStyle w:val="Compact"/>
+            </w:pPr>
+            <w:r>
+              <w:t xml:space="preserve">Stateless serverless isolation</w:t>
+            </w:r>
+          </w:p>
+        </w:tc>
+        <w:tc>
+          <w:tcPr/>
+          <w:p>
+            <w:pPr>
+              <w:pStyle w:val="Compact"/>
+            </w:pPr>
+            <w:r>
+              <w:t xml:space="preserve">AD-D-01</w:t>
+            </w:r>
+          </w:p>
+        </w:tc>
+        <w:tc>
+          <w:tcPr/>
+          <w:p>
+            <w:pPr>
+              <w:pStyle w:val="Compact"/>
+            </w:pPr>
+            <w:r>
+              <w:t xml:space="preserve">-</w:t>
+            </w:r>
+          </w:p>
+        </w:tc>
+        <w:tc>
+          <w:tcPr/>
+          <w:p>
+            <w:pPr>
+              <w:pStyle w:val="Compact"/>
+            </w:pPr>
+            <w:r>
+              <w:t xml:space="preserve">Vercel serverless deployment model;</w:t>
+            </w:r>
+            <w:r>
+              <w:t xml:space="preserve"> </w:t>
+            </w:r>
+            <w:r>
+              <w:rPr>
+                <w:rStyle w:val="VerbatimChar"/>
+              </w:rPr>
+              <w:t xml:space="preserve">src/instrumentation.ts</w:t>
+            </w:r>
+            <w:r>
+              <w:t xml:space="preserve">,</w:t>
+            </w:r>
+            <w:r>
+              <w:t xml:space="preserve"> </w:t>
+            </w:r>
+            <w:r>
+              <w:rPr>
+                <w:rStyle w:val="VerbatimChar"/>
+              </w:rPr>
+              <w:t xml:space="preserve">src/app/error.tsx</w:t>
+            </w:r>
+            <w:r>
+              <w:t xml:space="preserve">,</w:t>
+            </w:r>
+            <w:r>
+              <w:t xml:space="preserve"> </w:t>
+            </w:r>
+            <w:r>
+              <w:rPr>
+                <w:rStyle w:val="VerbatimChar"/>
+              </w:rPr>
+              <w:t xml:space="preserve">src/app/global-error.tsx</w:t>
+            </w:r>
+          </w:p>
+        </w:tc>
+      </w:tr>
+      <w:tr>
+        <w:tc>
+          <w:tcPr/>
+          <w:p>
+            <w:pPr>
+              <w:pStyle w:val="Compact"/>
+            </w:pPr>
+            <w:r>
+              <w:t xml:space="preserve">2.5.1</w:t>
+            </w:r>
+          </w:p>
+        </w:tc>
+        <w:tc>
+          <w:tcPr/>
+          <w:p>
+            <w:pPr>
+              <w:pStyle w:val="Compact"/>
+            </w:pPr>
+            <w:r>
+              <w:t xml:space="preserve">Scalability</w:t>
+            </w:r>
+          </w:p>
+        </w:tc>
+        <w:tc>
+          <w:tcPr/>
+          <w:p>
+            <w:pPr>
+              <w:pStyle w:val="Compact"/>
+            </w:pPr>
+            <w:r>
+              <w:t xml:space="preserve">T-01, T-02</w:t>
+            </w:r>
+          </w:p>
+        </w:tc>
+        <w:tc>
+          <w:tcPr/>
+          <w:p>
+            <w:pPr>
+              <w:pStyle w:val="Compact"/>
+            </w:pPr>
+            <w:r>
+              <w:t xml:space="preserve">AD-D-01</w:t>
+            </w:r>
+          </w:p>
+        </w:tc>
+        <w:tc>
+          <w:tcPr/>
+          <w:p>
+            <w:pPr>
+              <w:pStyle w:val="Compact"/>
+            </w:pPr>
+            <w:r>
+              <w:t xml:space="preserve">VP-7.4</w:t>
+            </w:r>
+          </w:p>
+        </w:tc>
+        <w:tc>
+          <w:tcPr/>
+          <w:p>
+            <w:pPr>
+              <w:pStyle w:val="Compact"/>
+            </w:pPr>
+            <w:r>
+              <w:t xml:space="preserve">RSC plus edge cache path;</w:t>
+            </w:r>
+            <w:r>
+              <w:t xml:space="preserve"> </w:t>
+            </w:r>
+            <w:r>
+              <w:rPr>
+                <w:rStyle w:val="VerbatimChar"/>
+              </w:rPr>
+              <w:t xml:space="preserve">tests/api/nfr-api.spec.ts</w:t>
+            </w:r>
+          </w:p>
+        </w:tc>
+      </w:tr>
+      <w:tr>
+        <w:tc>
+          <w:tcPr/>
+          <w:p>
+            <w:pPr>
+              <w:pStyle w:val="Compact"/>
+            </w:pPr>
+            <w:r>
+              <w:t xml:space="preserve">2.5.2</w:t>
+            </w:r>
+          </w:p>
+        </w:tc>
+        <w:tc>
+          <w:tcPr/>
+          <w:p>
+            <w:pPr>
+              <w:pStyle w:val="Compact"/>
+            </w:pPr>
+            <w:r>
+              <w:t xml:space="preserve">Scalability</w:t>
+            </w:r>
+          </w:p>
+        </w:tc>
+        <w:tc>
+          <w:tcPr/>
+          <w:p>
+            <w:pPr>
+              <w:pStyle w:val="Compact"/>
+            </w:pPr>
+            <w:r>
+              <w:t xml:space="preserve">T-09</w:t>
+            </w:r>
+          </w:p>
+        </w:tc>
+        <w:tc>
+          <w:tcPr/>
+          <w:p>
+            <w:pPr>
+              <w:pStyle w:val="Compact"/>
+            </w:pPr>
+            <w:r>
+              <w:t xml:space="preserve">AD-D-07</w:t>
+            </w:r>
+          </w:p>
+        </w:tc>
+        <w:tc>
+          <w:tcPr/>
+          <w:p>
+            <w:pPr>
+              <w:pStyle w:val="Compact"/>
+            </w:pPr>
+            <w:r>
+              <w:t xml:space="preserve">-</w:t>
+            </w:r>
+          </w:p>
+        </w:tc>
+        <w:tc>
+          <w:tcPr/>
+          <w:p>
+            <w:pPr>
+              <w:pStyle w:val="Compact"/>
+            </w:pPr>
+            <w:r>
+              <w:t xml:space="preserve">Meilisearch index isolation;</w:t>
+            </w:r>
+            <w:r>
+              <w:t xml:space="preserve"> </w:t>
+            </w:r>
+            <w:r>
+              <w:rPr>
+                <w:rStyle w:val="VerbatimChar"/>
+              </w:rPr>
+              <w:t xml:space="preserve">src/modules/search/services/search.service.ts</w:t>
+            </w:r>
+          </w:p>
+        </w:tc>
+      </w:tr>
+      <w:tr>
+        <w:tc>
+          <w:tcPr/>
+          <w:p>
+            <w:pPr>
+              <w:pStyle w:val="Compact"/>
+            </w:pPr>
+            <w:r>
+              <w:t xml:space="preserve">2.5.3</w:t>
+            </w:r>
+          </w:p>
+        </w:tc>
+        <w:tc>
+          <w:tcPr/>
+          <w:p>
+            <w:pPr>
+              <w:pStyle w:val="Compact"/>
+            </w:pPr>
+            <w:r>
+              <w:t xml:space="preserve">Scalability</w:t>
             </w:r>
           </w:p>
         </w:tc>
@@ -9189,110 +10251,153 @@
               <w:pStyle w:val="Compact"/>
             </w:pPr>
             <w:r>
-              <w:t xml:space="preserve">AD-D-03</w:t>
-            </w:r>
-          </w:p>
-        </w:tc>
-        <w:tc>
-          <w:tcPr/>
-          <w:p>
-            <w:pPr>
-              <w:pStyle w:val="Compact"/>
-            </w:pPr>
-            <w:r>
-              <w:t xml:space="preserve">VP-7.5</w:t>
-            </w:r>
-          </w:p>
-        </w:tc>
-      </w:tr>
-      <w:tr>
-        <w:tc>
-          <w:tcPr/>
-          <w:p>
-            <w:pPr>
-              <w:pStyle w:val="Compact"/>
-            </w:pPr>
-            <w:r>
-              <w:t xml:space="preserve">2.4.1</w:t>
-            </w:r>
-          </w:p>
-        </w:tc>
-        <w:tc>
-          <w:tcPr/>
-          <w:p>
-            <w:pPr>
-              <w:pStyle w:val="Compact"/>
-            </w:pPr>
-            <w:r>
-              <w:t xml:space="preserve">Availability</w:t>
-            </w:r>
-          </w:p>
-        </w:tc>
-        <w:tc>
-          <w:tcPr/>
-          <w:p>
-            <w:pPr>
-              <w:pStyle w:val="Compact"/>
-            </w:pPr>
-            <w:r>
-              <w:t xml:space="preserve">T-02 (CDN cache)</w:t>
-            </w:r>
-          </w:p>
-        </w:tc>
-        <w:tc>
-          <w:tcPr/>
-          <w:p>
-            <w:pPr>
-              <w:pStyle w:val="Compact"/>
-            </w:pPr>
-            <w:r>
-              <w:t xml:space="preserve">AD-D-01</w:t>
-            </w:r>
-          </w:p>
-        </w:tc>
-        <w:tc>
-          <w:tcPr/>
-          <w:p>
-            <w:pPr>
-              <w:pStyle w:val="Compact"/>
-            </w:pPr>
-            <w:r>
-              <w:t xml:space="preserve">VP-7.4</w:t>
-            </w:r>
-          </w:p>
-        </w:tc>
-      </w:tr>
-      <w:tr>
-        <w:tc>
-          <w:tcPr/>
-          <w:p>
-            <w:pPr>
-              <w:pStyle w:val="Compact"/>
-            </w:pPr>
-            <w:r>
-              <w:t xml:space="preserve">2.4.2</w:t>
-            </w:r>
-          </w:p>
-        </w:tc>
-        <w:tc>
-          <w:tcPr/>
-          <w:p>
-            <w:pPr>
-              <w:pStyle w:val="Compact"/>
-            </w:pPr>
-            <w:r>
-              <w:t xml:space="preserve">Availability</w:t>
-            </w:r>
-          </w:p>
-        </w:tc>
-        <w:tc>
-          <w:tcPr/>
-          <w:p>
-            <w:pPr>
-              <w:pStyle w:val="Compact"/>
-            </w:pPr>
-            <w:r>
-              <w:t xml:space="preserve">T-10 (DB fallback)</w:t>
+              <w:t xml:space="preserve">AD-D-02</w:t>
+            </w:r>
+          </w:p>
+        </w:tc>
+        <w:tc>
+          <w:tcPr/>
+          <w:p>
+            <w:pPr>
+              <w:pStyle w:val="Compact"/>
+            </w:pPr>
+            <w:r>
+              <w:t xml:space="preserve">-</w:t>
+            </w:r>
+          </w:p>
+        </w:tc>
+        <w:tc>
+          <w:tcPr/>
+          <w:p>
+            <w:pPr>
+              <w:pStyle w:val="Compact"/>
+            </w:pPr>
+            <w:r>
+              <w:t xml:space="preserve">Neon HTTP driver and transaction usage;</w:t>
+            </w:r>
+            <w:r>
+              <w:t xml:space="preserve"> </w:t>
+            </w:r>
+            <w:r>
+              <w:rPr>
+                <w:rStyle w:val="VerbatimChar"/>
+              </w:rPr>
+              <w:t xml:space="preserve">src/lib/db.ts</w:t>
+            </w:r>
+          </w:p>
+        </w:tc>
+      </w:tr>
+      <w:tr>
+        <w:tc>
+          <w:tcPr/>
+          <w:p>
+            <w:pPr>
+              <w:pStyle w:val="Compact"/>
+            </w:pPr>
+            <w:r>
+              <w:t xml:space="preserve">2.6.1</w:t>
+            </w:r>
+          </w:p>
+        </w:tc>
+        <w:tc>
+          <w:tcPr/>
+          <w:p>
+            <w:pPr>
+              <w:pStyle w:val="Compact"/>
+            </w:pPr>
+            <w:r>
+              <w:t xml:space="preserve">Modifiability</w:t>
+            </w:r>
+          </w:p>
+        </w:tc>
+        <w:tc>
+          <w:tcPr/>
+          <w:p>
+            <w:pPr>
+              <w:pStyle w:val="Compact"/>
+            </w:pPr>
+            <w:r>
+              <w:t xml:space="preserve">Gateway adapter isolation</w:t>
+            </w:r>
+          </w:p>
+        </w:tc>
+        <w:tc>
+          <w:tcPr/>
+          <w:p>
+            <w:pPr>
+              <w:pStyle w:val="Compact"/>
+            </w:pPr>
+            <w:r>
+              <w:t xml:space="preserve">AD-D-04</w:t>
+            </w:r>
+          </w:p>
+        </w:tc>
+        <w:tc>
+          <w:tcPr/>
+          <w:p>
+            <w:pPr>
+              <w:pStyle w:val="Compact"/>
+            </w:pPr>
+            <w:r>
+              <w:t xml:space="preserve">VP-7.3, VP-7.5</w:t>
+            </w:r>
+          </w:p>
+        </w:tc>
+        <w:tc>
+          <w:tcPr/>
+          <w:p>
+            <w:pPr>
+              <w:pStyle w:val="Compact"/>
+            </w:pPr>
+            <w:r>
+              <w:t xml:space="preserve">Payment code isolated in</w:t>
+            </w:r>
+            <w:r>
+              <w:t xml:space="preserve"> </w:t>
+            </w:r>
+            <w:r>
+              <w:rPr>
+                <w:rStyle w:val="VerbatimChar"/>
+              </w:rPr>
+              <w:t xml:space="preserve">src/modules/monetization/</w:t>
+            </w:r>
+            <w:r>
+              <w:t xml:space="preserve">; RTM UC-17</w:t>
+            </w:r>
+          </w:p>
+        </w:tc>
+      </w:tr>
+      <w:tr>
+        <w:tc>
+          <w:tcPr/>
+          <w:p>
+            <w:pPr>
+              <w:pStyle w:val="Compact"/>
+            </w:pPr>
+            <w:r>
+              <w:t xml:space="preserve">2.6.2</w:t>
+            </w:r>
+          </w:p>
+        </w:tc>
+        <w:tc>
+          <w:tcPr/>
+          <w:p>
+            <w:pPr>
+              <w:pStyle w:val="Compact"/>
+            </w:pPr>
+            <w:r>
+              <w:t xml:space="preserve">Modifiability</w:t>
+            </w:r>
+          </w:p>
+        </w:tc>
+        <w:tc>
+          <w:tcPr/>
+          <w:p>
+            <w:pPr>
+              <w:pStyle w:val="Compact"/>
+            </w:pPr>
+            <w:r>
+              <w:t xml:space="preserve">T-10</w:t>
             </w:r>
           </w:p>
         </w:tc>
@@ -9314,248 +10419,43 @@
               <w:pStyle w:val="Compact"/>
             </w:pPr>
             <w:r>
-              <w:t xml:space="preserve">—</w:t>
-            </w:r>
-          </w:p>
-        </w:tc>
-      </w:tr>
-      <w:tr>
-        <w:tc>
-          <w:tcPr/>
-          <w:p>
-            <w:pPr>
-              <w:pStyle w:val="Compact"/>
-            </w:pPr>
-            <w:r>
-              <w:t xml:space="preserve">2.4.3</w:t>
-            </w:r>
-          </w:p>
-        </w:tc>
-        <w:tc>
-          <w:tcPr/>
-          <w:p>
-            <w:pPr>
-              <w:pStyle w:val="Compact"/>
-            </w:pPr>
-            <w:r>
-              <w:t xml:space="preserve">Availability</w:t>
-            </w:r>
-          </w:p>
-        </w:tc>
-        <w:tc>
-          <w:tcPr/>
-          <w:p>
-            <w:pPr>
-              <w:pStyle w:val="Compact"/>
-            </w:pPr>
-            <w:r>
-              <w:t xml:space="preserve">—</w:t>
-            </w:r>
-          </w:p>
-        </w:tc>
-        <w:tc>
-          <w:tcPr/>
-          <w:p>
-            <w:pPr>
-              <w:pStyle w:val="Compact"/>
-            </w:pPr>
-            <w:r>
-              <w:t xml:space="preserve">AD-D-01</w:t>
-            </w:r>
-          </w:p>
-        </w:tc>
-        <w:tc>
-          <w:tcPr/>
-          <w:p>
-            <w:pPr>
-              <w:pStyle w:val="Compact"/>
-            </w:pPr>
-            <w:r>
-              <w:t xml:space="preserve">—</w:t>
-            </w:r>
-          </w:p>
-        </w:tc>
-      </w:tr>
-      <w:tr>
-        <w:tc>
-          <w:tcPr/>
-          <w:p>
-            <w:pPr>
-              <w:pStyle w:val="Compact"/>
-            </w:pPr>
-            <w:r>
-              <w:t xml:space="preserve">2.5.1</w:t>
-            </w:r>
-          </w:p>
-        </w:tc>
-        <w:tc>
-          <w:tcPr/>
-          <w:p>
-            <w:pPr>
-              <w:pStyle w:val="Compact"/>
-            </w:pPr>
-            <w:r>
-              <w:t xml:space="preserve">Scalability</w:t>
-            </w:r>
-          </w:p>
-        </w:tc>
-        <w:tc>
-          <w:tcPr/>
-          <w:p>
-            <w:pPr>
-              <w:pStyle w:val="Compact"/>
-            </w:pPr>
-            <w:r>
-              <w:t xml:space="preserve">T-01, T-02</w:t>
-            </w:r>
-          </w:p>
-        </w:tc>
-        <w:tc>
-          <w:tcPr/>
-          <w:p>
-            <w:pPr>
-              <w:pStyle w:val="Compact"/>
-            </w:pPr>
-            <w:r>
-              <w:t xml:space="preserve">AD-D-01</w:t>
-            </w:r>
-          </w:p>
-        </w:tc>
-        <w:tc>
-          <w:tcPr/>
-          <w:p>
-            <w:pPr>
-              <w:pStyle w:val="Compact"/>
-            </w:pPr>
-            <w:r>
-              <w:t xml:space="preserve">VP-7.4</w:t>
-            </w:r>
-          </w:p>
-        </w:tc>
-      </w:tr>
-      <w:tr>
-        <w:tc>
-          <w:tcPr/>
-          <w:p>
-            <w:pPr>
-              <w:pStyle w:val="Compact"/>
-            </w:pPr>
-            <w:r>
-              <w:t xml:space="preserve">2.5.2</w:t>
-            </w:r>
-          </w:p>
-        </w:tc>
-        <w:tc>
-          <w:tcPr/>
-          <w:p>
-            <w:pPr>
-              <w:pStyle w:val="Compact"/>
-            </w:pPr>
-            <w:r>
-              <w:t xml:space="preserve">Scalability</w:t>
-            </w:r>
-          </w:p>
-        </w:tc>
-        <w:tc>
-          <w:tcPr/>
-          <w:p>
-            <w:pPr>
-              <w:pStyle w:val="Compact"/>
-            </w:pPr>
-            <w:r>
-              <w:t xml:space="preserve">T-09</w:t>
-            </w:r>
-          </w:p>
-        </w:tc>
-        <w:tc>
-          <w:tcPr/>
-          <w:p>
-            <w:pPr>
-              <w:pStyle w:val="Compact"/>
-            </w:pPr>
-            <w:r>
-              <w:t xml:space="preserve">AD-D-07</w:t>
-            </w:r>
-          </w:p>
-        </w:tc>
-        <w:tc>
-          <w:tcPr/>
-          <w:p>
-            <w:pPr>
-              <w:pStyle w:val="Compact"/>
-            </w:pPr>
-            <w:r>
-              <w:t xml:space="preserve">—</w:t>
-            </w:r>
-          </w:p>
-        </w:tc>
-      </w:tr>
-      <w:tr>
-        <w:tc>
-          <w:tcPr/>
-          <w:p>
-            <w:pPr>
-              <w:pStyle w:val="Compact"/>
-            </w:pPr>
-            <w:r>
-              <w:t xml:space="preserve">2.5.3</w:t>
-            </w:r>
-          </w:p>
-        </w:tc>
-        <w:tc>
-          <w:tcPr/>
-          <w:p>
-            <w:pPr>
-              <w:pStyle w:val="Compact"/>
-            </w:pPr>
-            <w:r>
-              <w:t xml:space="preserve">Scalability</w:t>
-            </w:r>
-          </w:p>
-        </w:tc>
-        <w:tc>
-          <w:tcPr/>
-          <w:p>
-            <w:pPr>
-              <w:pStyle w:val="Compact"/>
-            </w:pPr>
-            <w:r>
-              <w:t xml:space="preserve">T-06</w:t>
-            </w:r>
-          </w:p>
-        </w:tc>
-        <w:tc>
-          <w:tcPr/>
-          <w:p>
-            <w:pPr>
-              <w:pStyle w:val="Compact"/>
-            </w:pPr>
-            <w:r>
-              <w:t xml:space="preserve">AD-D-02</w:t>
-            </w:r>
-          </w:p>
-        </w:tc>
-        <w:tc>
-          <w:tcPr/>
-          <w:p>
-            <w:pPr>
-              <w:pStyle w:val="Compact"/>
-            </w:pPr>
-            <w:r>
-              <w:t xml:space="preserve">—</w:t>
-            </w:r>
-          </w:p>
-        </w:tc>
-      </w:tr>
-      <w:tr>
-        <w:tc>
-          <w:tcPr/>
-          <w:p>
-            <w:pPr>
-              <w:pStyle w:val="Compact"/>
-            </w:pPr>
-            <w:r>
-              <w:t xml:space="preserve">2.6.1</w:t>
+              <w:t xml:space="preserve">-</w:t>
+            </w:r>
+          </w:p>
+        </w:tc>
+        <w:tc>
+          <w:tcPr/>
+          <w:p>
+            <w:pPr>
+              <w:pStyle w:val="Compact"/>
+            </w:pPr>
+            <w:r>
+              <w:t xml:space="preserve">Search provider behind</w:t>
+            </w:r>
+            <w:r>
+              <w:t xml:space="preserve"> </w:t>
+            </w:r>
+            <w:r>
+              <w:rPr>
+                <w:rStyle w:val="VerbatimChar"/>
+              </w:rPr>
+              <w:t xml:space="preserve">searchNovels()</w:t>
+            </w:r>
+            <w:r>
+              <w:t xml:space="preserve">; RTM UC-10</w:t>
+            </w:r>
+          </w:p>
+        </w:tc>
+      </w:tr>
+      <w:tr>
+        <w:tc>
+          <w:tcPr/>
+          <w:p>
+            <w:pPr>
+              <w:pStyle w:val="Compact"/>
+            </w:pPr>
+            <w:r>
+              <w:t xml:space="preserve">2.6.3</w:t>
             </w:r>
           </w:p>
         </w:tc>
@@ -9577,7 +10477,108 @@
               <w:pStyle w:val="Compact"/>
             </w:pPr>
             <w:r>
-              <w:t xml:space="preserve">—</w:t>
+              <w:t xml:space="preserve">T-05</w:t>
+            </w:r>
+          </w:p>
+        </w:tc>
+        <w:tc>
+          <w:tcPr/>
+          <w:p>
+            <w:pPr>
+              <w:pStyle w:val="Compact"/>
+            </w:pPr>
+            <w:r>
+              <w:t xml:space="preserve">AD-D-05</w:t>
+            </w:r>
+          </w:p>
+        </w:tc>
+        <w:tc>
+          <w:tcPr/>
+          <w:p>
+            <w:pPr>
+              <w:pStyle w:val="Compact"/>
+            </w:pPr>
+            <w:r>
+              <w:t xml:space="preserve">VP-7.1</w:t>
+            </w:r>
+          </w:p>
+        </w:tc>
+        <w:tc>
+          <w:tcPr/>
+          <w:p>
+            <w:pPr>
+              <w:pStyle w:val="Compact"/>
+            </w:pPr>
+            <w:r>
+              <w:t xml:space="preserve">Auth code isolated in</w:t>
+            </w:r>
+            <w:r>
+              <w:t xml:space="preserve"> </w:t>
+            </w:r>
+            <w:r>
+              <w:rPr>
+                <w:rStyle w:val="VerbatimChar"/>
+              </w:rPr>
+              <w:t xml:space="preserve">src/lib/auth.ts</w:t>
+            </w:r>
+            <w:r>
+              <w:t xml:space="preserve">,</w:t>
+            </w:r>
+            <w:r>
+              <w:t xml:space="preserve"> </w:t>
+            </w:r>
+            <w:r>
+              <w:rPr>
+                <w:rStyle w:val="VerbatimChar"/>
+              </w:rPr>
+              <w:t xml:space="preserve">src/lib/auth-client.ts</w:t>
+            </w:r>
+            <w:r>
+              <w:t xml:space="preserve">,</w:t>
+            </w:r>
+            <w:r>
+              <w:t xml:space="preserve"> </w:t>
+            </w:r>
+            <w:r>
+              <w:rPr>
+                <w:rStyle w:val="VerbatimChar"/>
+              </w:rPr>
+              <w:t xml:space="preserve">src/middleware.ts</w:t>
+            </w:r>
+          </w:p>
+        </w:tc>
+      </w:tr>
+      <w:tr>
+        <w:tc>
+          <w:tcPr/>
+          <w:p>
+            <w:pPr>
+              <w:pStyle w:val="Compact"/>
+            </w:pPr>
+            <w:r>
+              <w:t xml:space="preserve">2.6.4</w:t>
+            </w:r>
+          </w:p>
+        </w:tc>
+        <w:tc>
+          <w:tcPr/>
+          <w:p>
+            <w:pPr>
+              <w:pStyle w:val="Compact"/>
+            </w:pPr>
+            <w:r>
+              <w:t xml:space="preserve">Modifiability</w:t>
+            </w:r>
+          </w:p>
+        </w:tc>
+        <w:tc>
+          <w:tcPr/>
+          <w:p>
+            <w:pPr>
+              <w:pStyle w:val="Compact"/>
+            </w:pPr>
+            <w:r>
+              <w:t xml:space="preserve">Module public exports</w:t>
             </w:r>
           </w:p>
         </w:tc>
@@ -9599,184 +10600,47 @@
               <w:pStyle w:val="Compact"/>
             </w:pPr>
             <w:r>
-              <w:t xml:space="preserve">VP-7.3, VP-7.5</w:t>
-            </w:r>
-          </w:p>
-        </w:tc>
-      </w:tr>
-      <w:tr>
-        <w:tc>
-          <w:tcPr/>
-          <w:p>
-            <w:pPr>
-              <w:pStyle w:val="Compact"/>
-            </w:pPr>
-            <w:r>
-              <w:t xml:space="preserve">2.6.2</w:t>
-            </w:r>
-          </w:p>
-        </w:tc>
-        <w:tc>
-          <w:tcPr/>
-          <w:p>
-            <w:pPr>
-              <w:pStyle w:val="Compact"/>
-            </w:pPr>
-            <w:r>
-              <w:t xml:space="preserve">Modifiability</w:t>
-            </w:r>
-          </w:p>
-        </w:tc>
-        <w:tc>
-          <w:tcPr/>
-          <w:p>
-            <w:pPr>
-              <w:pStyle w:val="Compact"/>
-            </w:pPr>
-            <w:r>
-              <w:t xml:space="preserve">T-10</w:t>
-            </w:r>
-          </w:p>
-        </w:tc>
-        <w:tc>
-          <w:tcPr/>
-          <w:p>
-            <w:pPr>
-              <w:pStyle w:val="Compact"/>
-            </w:pPr>
-            <w:r>
-              <w:t xml:space="preserve">AD-D-07</w:t>
-            </w:r>
-          </w:p>
-        </w:tc>
-        <w:tc>
-          <w:tcPr/>
-          <w:p>
-            <w:pPr>
-              <w:pStyle w:val="Compact"/>
-            </w:pPr>
-            <w:r>
-              <w:t xml:space="preserve">—</w:t>
-            </w:r>
-          </w:p>
-        </w:tc>
-      </w:tr>
-      <w:tr>
-        <w:tc>
-          <w:tcPr/>
-          <w:p>
-            <w:pPr>
-              <w:pStyle w:val="Compact"/>
-            </w:pPr>
-            <w:r>
-              <w:t xml:space="preserve">2.6.3</w:t>
-            </w:r>
-          </w:p>
-        </w:tc>
-        <w:tc>
-          <w:tcPr/>
-          <w:p>
-            <w:pPr>
-              <w:pStyle w:val="Compact"/>
-            </w:pPr>
-            <w:r>
-              <w:t xml:space="preserve">Modifiability</w:t>
-            </w:r>
-          </w:p>
-        </w:tc>
-        <w:tc>
-          <w:tcPr/>
-          <w:p>
-            <w:pPr>
-              <w:pStyle w:val="Compact"/>
-            </w:pPr>
-            <w:r>
-              <w:t xml:space="preserve">T-05</w:t>
-            </w:r>
-          </w:p>
-        </w:tc>
-        <w:tc>
-          <w:tcPr/>
-          <w:p>
-            <w:pPr>
-              <w:pStyle w:val="Compact"/>
-            </w:pPr>
-            <w:r>
-              <w:t xml:space="preserve">AD-D-05</w:t>
-            </w:r>
-          </w:p>
-        </w:tc>
-        <w:tc>
-          <w:tcPr/>
-          <w:p>
-            <w:pPr>
-              <w:pStyle w:val="Compact"/>
-            </w:pPr>
-            <w:r>
-              <w:t xml:space="preserve">VP-7.1</w:t>
-            </w:r>
-          </w:p>
-        </w:tc>
-      </w:tr>
-      <w:tr>
-        <w:tc>
-          <w:tcPr/>
-          <w:p>
-            <w:pPr>
-              <w:pStyle w:val="Compact"/>
-            </w:pPr>
-            <w:r>
-              <w:t xml:space="preserve">2.6.4</w:t>
-            </w:r>
-          </w:p>
-        </w:tc>
-        <w:tc>
-          <w:tcPr/>
-          <w:p>
-            <w:pPr>
-              <w:pStyle w:val="Compact"/>
-            </w:pPr>
-            <w:r>
-              <w:t xml:space="preserve">Modifiability</w:t>
-            </w:r>
-          </w:p>
-        </w:tc>
-        <w:tc>
-          <w:tcPr/>
-          <w:p>
-            <w:pPr>
-              <w:pStyle w:val="Compact"/>
-            </w:pPr>
-            <w:r>
-              <w:t xml:space="preserve">—</w:t>
-            </w:r>
-          </w:p>
-        </w:tc>
-        <w:tc>
-          <w:tcPr/>
-          <w:p>
-            <w:pPr>
-              <w:pStyle w:val="Compact"/>
-            </w:pPr>
-            <w:r>
-              <w:t xml:space="preserve">AD-D-04</w:t>
-            </w:r>
-          </w:p>
-        </w:tc>
-        <w:tc>
-          <w:tcPr/>
-          <w:p>
-            <w:pPr>
-              <w:pStyle w:val="Compact"/>
-            </w:pPr>
-            <w:r>
-              <w:t xml:space="preserve">—</w:t>
+              <w:t xml:space="preserve">-</w:t>
+            </w:r>
+          </w:p>
+        </w:tc>
+        <w:tc>
+          <w:tcPr/>
+          <w:p>
+            <w:pPr>
+              <w:pStyle w:val="Compact"/>
+            </w:pPr>
+            <w:r>
+              <w:rPr>
+                <w:rStyle w:val="VerbatimChar"/>
+              </w:rPr>
+              <w:t xml:space="preserve">src/modules/*/index.ts</w:t>
+            </w:r>
+            <w:r>
+              <w:t xml:space="preserve">, ESLint/import review,</w:t>
+            </w:r>
+            <w:r>
+              <w:t xml:space="preserve"> </w:t>
+            </w:r>
+            <w:r>
+              <w:rPr>
+                <w:rStyle w:val="VerbatimChar"/>
+              </w:rPr>
+              <w:t xml:space="preserve">npm run lint</w:t>
             </w:r>
           </w:p>
         </w:tc>
       </w:tr>
     </w:tbl>
-    <w:bookmarkEnd w:id="62"/>
+    <w:p>
+      <w:pPr>
+        <w:pStyle w:val="BodyText"/>
+      </w:pPr>
+      <w:r>
+        <w:t xml:space="preserve">The RTM is the final verification layer: SRS use cases define what must work, ADD identifies the quality scenarios, SAD records the tactics and decisions, and RTM links those requirements to backend, UI, and integration tests.</w:t>
+      </w:r>
+    </w:p>
+    <w:bookmarkEnd w:id="63"/>
     <w:sectPr>
       <w:footnotePr>
         <w:numRestart w:val="eachSect"/>

</xml_diff>